<commit_message>
Rename cahier de tp
</commit_message>
<xml_diff>
--- a/TPsC/CahierTPC.docx
+++ b/TPsC/CahierTPC.docx
@@ -254,6 +254,13 @@
           <w:iCs/>
         </w:rPr>
         <w:t>confluentinc/cp-schema-registry</w:t>
+      </w:r>
+      <w:r>
+        <w:rPr>
+          <w:i/>
+          <w:iCs/>
+        </w:rPr>
+        <w:t> :8.2.0</w:t>
       </w:r>
     </w:p>
     <w:p>
@@ -5721,7 +5728,20 @@
         <w:pStyle w:val="Textbody"/>
       </w:pPr>
       <w:r>
-        <w:t>Reprendre les sources du projet KafkaConsumer sans les classes du mo</w:t>
+        <w:t xml:space="preserve">Reprendre les sources du projet </w:t>
+      </w:r>
+      <w:r>
+        <w:rPr>
+          <w:i/>
+          <w:iCs/>
+        </w:rPr>
+        <w:t>KafkaConsumer</w:t>
+      </w:r>
+      <w:r>
+        <w:t xml:space="preserve"> sans les classes du mo</w:t>
+      </w:r>
+      <w:r>
+        <w:t>d</w:t>
       </w:r>
       <w:r>
         <w:t>èle</w:t>
@@ -5744,7 +5764,14 @@
         <w:t>’</w:t>
       </w:r>
       <w:r>
-        <w:t>utiliser la classe GenericRecord</w:t>
+        <w:t xml:space="preserve">utiliser la classe </w:t>
+      </w:r>
+      <w:r>
+        <w:rPr>
+          <w:i/>
+          <w:iCs/>
+        </w:rPr>
+        <w:t>GenericRecord</w:t>
       </w:r>
     </w:p>
     <w:p>
@@ -5758,7 +5785,13 @@
         <w:t>désé</w:t>
       </w:r>
       <w:r>
-        <w:t>rialiseur de la thread de consommation</w:t>
+        <w:t xml:space="preserve">rialiseur </w:t>
+      </w:r>
+      <w:r>
+        <w:t>du thread</w:t>
+      </w:r>
+      <w:r>
+        <w:t xml:space="preserve"> de consommation</w:t>
       </w:r>
       <w:r>
         <w:t>.</w:t>

</xml_diff>